<commit_message>
Update changelog and Lead Backend resume: rebalance resume layout by removing redundant technology line and least relevant legacy role, and enhance content clarity.
</commit_message>
<xml_diff>
--- a/resumes/lead-backend/resume.docx
+++ b/resumes/lead-backend/resume.docx
@@ -125,22 +125,6 @@
         <w:t xml:space="preserve">•  </w:t>
       </w:r>
       <w:r>
-        <w:t>Designed and delivered services across a microservices architecture of nearly 25 running services.</w:t>
-      </w:r>
-    </w:p>
-    <w:p>
-      <w:pPr>
-        <w:spacing w:after="36" w:line="245" w:lineRule="auto"/>
-        <w:ind w:left="245" w:hanging="187"/>
-        <w:keepLines/>
-      </w:pPr>
-      <w:r>
-        <w:rPr>
-          <w:color w:val="1B375C"/>
-        </w:rPr>
-        <w:t xml:space="preserve">•  </w:t>
-      </w:r>
-      <w:r>
         <w:t>Helped deliver an internal election-management platform supporting 50,000 users and approximately 100,000 daily requests during election periods.</w:t>
       </w:r>
     </w:p>
@@ -158,22 +142,6 @@
       </w:r>
       <w:r>
         <w:t>Reduced exam-management system response time by 30% through Redis caching and backend performance improvements.</w:t>
-      </w:r>
-    </w:p>
-    <w:p>
-      <w:pPr>
-        <w:spacing w:after="36" w:line="245" w:lineRule="auto"/>
-        <w:ind w:left="245" w:hanging="187"/>
-        <w:keepLines/>
-      </w:pPr>
-      <w:r>
-        <w:rPr>
-          <w:color w:val="1B375C"/>
-        </w:rPr>
-        <w:t xml:space="preserve">•  </w:t>
-      </w:r>
-      <w:r>
-        <w:t>Supported production workflows used by 2,500+ administrators, 1,000 invigilators, and 1,000 examinees, including payments for nearly 30,000 students.</w:t>
       </w:r>
     </w:p>
     <w:p>
@@ -299,22 +267,6 @@
       </w:r>
       <w:r>
         <w:t>Led backend engineering activities for an Election Management System, including task allocation, grooming, planning, implementation guidance, and code reviews within a 30-person development team.</w:t>
-      </w:r>
-    </w:p>
-    <w:p>
-      <w:pPr>
-        <w:spacing w:after="36" w:line="245" w:lineRule="auto"/>
-        <w:ind w:left="245" w:hanging="187"/>
-        <w:keepLines/>
-      </w:pPr>
-      <w:r>
-        <w:rPr>
-          <w:color w:val="1B375C"/>
-        </w:rPr>
-        <w:t xml:space="preserve">•  </w:t>
-      </w:r>
-      <w:r>
-        <w:t>Key technologies: Java, Spring Boot, Hibernate, REST APIs, Docker, Kubernetes, Keycloak.</w:t>
       </w:r>
     </w:p>
     <w:p>
@@ -497,41 +449,6 @@
       </w:r>
       <w:r>
         <w:t>Contributed to large-file upload capabilities, relational data modeling, enterprise workflow features, and stakeholder-aligned delivery.</w:t>
-      </w:r>
-    </w:p>
-    <w:p>
-      <w:pPr>
-        <w:pStyle w:val="DesignedSubsection"/>
-        <w:spacing w:before="90" w:after="10"/>
-        <w:keepNext/>
-      </w:pPr>
-      <w:r>
-        <w:t>Jaliks Soft IT Limited - .NET Developer</w:t>
-      </w:r>
-    </w:p>
-    <w:p>
-      <w:pPr>
-        <w:spacing w:after="40"/>
-        <w:keepLines/>
-      </w:pPr>
-      <w:r>
-        <w:t>Khulna, Bangladesh | February 2016 - June 2016</w:t>
-      </w:r>
-    </w:p>
-    <w:p>
-      <w:pPr>
-        <w:spacing w:after="36" w:line="245" w:lineRule="auto"/>
-        <w:ind w:left="245" w:hanging="187"/>
-        <w:keepLines/>
-      </w:pPr>
-      <w:r>
-        <w:rPr>
-          <w:color w:val="1B375C"/>
-        </w:rPr>
-        <w:t xml:space="preserve">•  </w:t>
-      </w:r>
-      <w:r>
-        <w:t>Implemented features and resolved defects for a large-scale education application using ASP.NET, C#, and SQL Server.</w:t>
       </w:r>
     </w:p>
     <w:p>

</xml_diff>

<commit_message>
Update resumes and changelog: restore Jaliks Soft IT Limited experience and enhance role-specific resumes with deployment contributions
</commit_message>
<xml_diff>
--- a/resumes/lead-backend/resume.docx
+++ b/resumes/lead-backend/resume.docx
@@ -319,6 +319,22 @@
     </w:p>
     <w:p>
       <w:pPr>
+        <w:spacing w:after="36" w:line="245" w:lineRule="auto"/>
+        <w:ind w:left="245" w:hanging="187"/>
+        <w:keepLines/>
+      </w:pPr>
+      <w:r>
+        <w:rPr>
+          <w:color w:val="1B375C"/>
+        </w:rPr>
+        <w:t xml:space="preserve">•  </w:t>
+      </w:r>
+      <w:r>
+        <w:t>Contributed to approximately 30 deployments by writing Dockerfiles and diagnosing deployment failures in the organization's self-managed Kubernetes data center.</w:t>
+      </w:r>
+    </w:p>
+    <w:p>
+      <w:pPr>
         <w:pStyle w:val="DesignedSubsection"/>
         <w:spacing w:before="90" w:after="10"/>
         <w:keepNext/>
@@ -453,6 +469,57 @@
     </w:p>
     <w:p>
       <w:pPr>
+        <w:pStyle w:val="DesignedSubsection"/>
+        <w:spacing w:before="90" w:after="10"/>
+        <w:keepNext/>
+      </w:pPr>
+      <w:r>
+        <w:t>Jaliks Soft IT Limited - .NET Developer</w:t>
+      </w:r>
+    </w:p>
+    <w:p>
+      <w:pPr>
+        <w:spacing w:after="40"/>
+        <w:keepLines/>
+      </w:pPr>
+      <w:r>
+        <w:t>Khulna, Bangladesh | February 2016 - June 2016</w:t>
+      </w:r>
+    </w:p>
+    <w:p>
+      <w:pPr>
+        <w:spacing w:after="36" w:line="245" w:lineRule="auto"/>
+        <w:ind w:left="245" w:hanging="187"/>
+        <w:keepLines/>
+      </w:pPr>
+      <w:r>
+        <w:rPr>
+          <w:color w:val="1B375C"/>
+        </w:rPr>
+        <w:t xml:space="preserve">•  </w:t>
+      </w:r>
+      <w:r>
+        <w:t>Implemented features and resolved defects for a large-scale education application using ASP.NET, C#, and SQL Server.</w:t>
+      </w:r>
+    </w:p>
+    <w:p>
+      <w:pPr>
+        <w:spacing w:after="36" w:line="245" w:lineRule="auto"/>
+        <w:ind w:left="245" w:hanging="187"/>
+        <w:keepLines/>
+      </w:pPr>
+      <w:r>
+        <w:rPr>
+          <w:color w:val="1B375C"/>
+        </w:rPr>
+        <w:t xml:space="preserve">•  </w:t>
+      </w:r>
+      <w:r>
+        <w:t>Developed and maintained SQL Server database components, including stored procedures, triggers, and views.</w:t>
+      </w:r>
+    </w:p>
+    <w:p>
+      <w:pPr>
         <w:pStyle w:val="DesignedSection"/>
         <w:spacing w:before="140" w:after="60"/>
         <w:pBdr>
@@ -471,6 +538,51 @@
       </w:pPr>
       <w:r>
         <w:t>Khulna University | Bachelor of Science (B.Sc.) in Computer Science and Engineering | 2011–2016</w:t>
+      </w:r>
+    </w:p>
+    <w:p>
+      <w:pPr>
+        <w:pStyle w:val="DesignedSection"/>
+        <w:spacing w:before="140" w:after="60"/>
+        <w:pBdr>
+          <w:bottom w:val="single" w:sz="8" w:space="5" w:color="1B375C"/>
+        </w:pBdr>
+        <w:keepNext/>
+      </w:pPr>
+      <w:r>
+        <w:t>PUBLICATIONS</w:t>
+      </w:r>
+    </w:p>
+    <w:p>
+      <w:pPr>
+        <w:spacing w:after="36" w:line="245" w:lineRule="auto"/>
+        <w:ind w:left="245" w:hanging="187"/>
+        <w:keepLines/>
+      </w:pPr>
+      <w:r>
+        <w:rPr>
+          <w:color w:val="1B375C"/>
+        </w:rPr>
+        <w:t xml:space="preserve">•  </w:t>
+      </w:r>
+      <w:r>
+        <w:t>Temporal Relation Extraction using Apriori Algorithm — ICIEV, 2016</w:t>
+      </w:r>
+    </w:p>
+    <w:p>
+      <w:pPr>
+        <w:spacing w:after="36" w:line="245" w:lineRule="auto"/>
+        <w:ind w:left="245" w:hanging="187"/>
+        <w:keepLines/>
+      </w:pPr>
+      <w:r>
+        <w:rPr>
+          <w:color w:val="1B375C"/>
+        </w:rPr>
+        <w:t xml:space="preserve">•  </w:t>
+      </w:r>
+      <w:r>
+        <w:t>An Effective Attendance Monitoring System with Fraud Prevention Technique for Educational Institutions — International Journal of Engineering and Technology, 2018</w:t>
       </w:r>
     </w:p>
     <w:sectPr>

</xml_diff>